<commit_message>
refactor: optimize production attendance calculation by employee and relax night shift punch window validation
</commit_message>
<xml_diff>
--- a/backend/src/main/resources/hr/templates/probation-contract-template.docx
+++ b/backend/src/main/resources/hr/templates/probation-contract-template.docx
@@ -11,6 +11,7 @@
           <w:numId w:val="0"/>
         </w:numPr>
         <w:spacing w:lineRule="auto" w:line="240" w:before="240" w:after="0"/>
+        <w:ind w:hanging="0" w:start="0"/>
         <w:jc w:val="center"/>
         <w:outlineLvl w:val="1"/>
         <w:rPr>
@@ -85,7 +86,7 @@
         <mc:AlternateContent>
           <mc:Choice Requires="wps">
             <w:drawing>
-              <wp:anchor distT="0" distB="0" distL="0" distR="0" simplePos="0" relativeHeight="2" behindDoc="0" locked="0" layoutInCell="0" allowOverlap="1" wp14:anchorId="5A0E14AE">
+              <wp:anchor distT="5080" distB="5080" distL="5080" distR="5080" simplePos="0" relativeHeight="2" behindDoc="0" locked="0" layoutInCell="0" allowOverlap="1" wp14:anchorId="5A0E14AE">
                 <wp:simplePos x="0" y="0"/>
                 <wp:positionH relativeFrom="page">
                   <wp:posOffset>2984500</wp:posOffset>
@@ -791,7 +792,7 @@
           <w:szCs w:val="24"/>
           <w:lang w:val="nl-NL"/>
         </w:rPr>
-        <w:t>- Do lãnh đạo Công ty, Quản đốc phân công công việc. (Các cá nhân được bổ nhiệm hoặc ủy quyền quản lý công việc phân công).</w:t>
+        <w:t>- Do lãnh đạo Công ty phân công công việc. (Các cá nhân được bổ nhiệm hoặc ủy quyền quản lý công việc phân công).</w:t>
       </w:r>
     </w:p>
     <w:p>
@@ -1891,6 +1892,7 @@
     <w:rsid w:val="00ab1d7e"/>
     <w:pPr>
       <w:widowControl/>
+      <w:suppressAutoHyphens w:val="true"/>
       <w:bidi w:val="0"/>
       <w:spacing w:lineRule="auto" w:line="360" w:before="0" w:after="0"/>
       <w:jc w:val="start"/>
@@ -2004,6 +2006,7 @@
     <w:rsid w:val="00ab1d7e"/>
     <w:pPr>
       <w:widowControl/>
+      <w:suppressAutoHyphens w:val="true"/>
       <w:bidi w:val="0"/>
       <w:spacing w:lineRule="auto" w:line="240" w:before="0" w:after="0"/>
       <w:jc w:val="start"/>

</xml_diff>